<commit_message>
fix: complete MVP2 Excel import validation and demo
</commit_message>
<xml_diff>
--- a/docs/B组需求边界验收标准与MVP实施方案.docx
+++ b/docs/B组需求边界验收标准与MVP实施方案.docx
@@ -15,7 +15,7 @@
         <w:rPr>
           <w:b w:val="0"/>
         </w:rPr>
-        <w:t>其他费用录入 导入 导出  ｜  2026年10月10日  ｜  MVP 1完成更新版</w:t>
+        <w:t>其他费用录入 导入 导出  ｜  2026年10月10日  ｜  MVP 2完成更新版</w:t>
       </w:r>
     </w:p>
     <w:p>
@@ -55,7 +55,7 @@
         <w:rPr>
           <w:b w:val="0"/>
         </w:rPr>
-        <w:t>B组包含六个业务接口：新增、查询、修改、删除、导入、导出，另有Reset用于重新初始化。技术要求是C#、.NET Framework 4.8、WebAPI、SQLite和NPOI。MVP 1已实现分层、SQLite、Reset和CRUD，通过49个自动化用例及9项真实HTTP检查。导入、导出和最终交付尚待完成。</w:t>
+        <w:t>B组包含新增、查询、修改、删除、导入、导出六个业务接口，另有Reset。技术要求是C#、.NET Framework 4.8、WebAPI、SQLite和NPOI。MVP 1、2已完成：68个自动化用例、9项CRUD与8项导入真实HTTP检查通过。导出和最终交付尚待完成。</w:t>
       </w:r>
     </w:p>
     <w:tbl>
@@ -2177,7 +2177,7 @@
         <w:rPr>
           <w:b w:val="0"/>
         </w:rPr>
-        <w:t>【实现建议】有效行逐行事务提交。同文件同名按顺序处理，最后一条有效行覆盖；无效行不覆盖此前有效值。更新保留Id，收入和备注可被清空。系统级数据库故障应停止并说明已提交和未处理状态。</w:t>
+        <w:t>【已实现】有效行逐行事务提交，同名按顺序覆盖；无效行不覆盖此前有效值。更新保留Id和顺序，收入和备注可清空。未预期的数据库故障停止请求，已提交行保留，可经查询核对；系统故障暂不返回部分成功报告。</w:t>
       </w:r>
     </w:p>
     <w:p>
@@ -2185,7 +2185,7 @@
         <w:rPr>
           <w:b w:val="0"/>
         </w:rPr>
-        <w:t>报告含SuccessCount、InsertedCount、UpdatedCount、FailedCount、SkippedCount和Errors。成功按输入行计数，等于新增加更新；Errors含从1开始的原Excel行号、Field和Reason。</w:t>
+        <w:t>报告含SuccessCount、CreatedCount、UpdatedCount、FailureCount和Errors。成功按输入行计数，等于新增加更新；失败按行计数。Errors含从1开始的RowNumber、Field、Code和Reason；一行多个字段错误不会重复增加失败行数。</w:t>
       </w:r>
     </w:p>
     <w:p>
@@ -3531,7 +3531,7 @@
         <w:rPr>
           <w:b w:val="0"/>
         </w:rPr>
-        <w:t>建立OtherFees.sln，一个控制台应用程序Api、三个类库Domain/Application/Infrastructure及Tests项目，目标全部为.NET Framework 4.8。设置Api为启动项目，全方案统一x64，按上一页建立引用。</w:t>
+        <w:t>方案含Api控制台、Domain/Application/Infrastructure三个类库及Tests。全部net48、x64；Api为启动项目，依赖按上一页建立。</w:t>
       </w:r>
     </w:p>
     <w:p>
@@ -3547,7 +3547,7 @@
         <w:rPr>
           <w:b w:val="0"/>
         </w:rPr>
-        <w:t>WebAPI、OWIN和SQLite已按以下版本还原并锁定在csproj及packages.lock.json。NPOI待MVP 2接入，当前没有Excel导入导出实现。下列命令展示依赖归属，实际构建用项目脚本。</w:t>
+        <w:t>WebAPI、OWIN、SQLite和NPOI 2.7.6已按以下版本还原并锁定。MVP 2已接入Excel导入；导出待MVP 3。下列命令展示依赖归属，实际构建使用项目脚本。</w:t>
       </w:r>
     </w:p>
     <w:p>
@@ -3636,7 +3636,7 @@
         <w:rPr>
           <w:b w:val="0"/>
         </w:rPr>
-        <w:t>App.config配置BaseUrl=http://localhost:5080/、DatabasePath=App_Data/other-fees.sqlite及EnableReset。直接运行exe时相对路径基于exe目录；run.ps1显式使用b-group/App_Data中的绝对路径，避免读错库。模板路径待导出阶段增加。</w:t>
+        <w:t>App.config定义BaseUrl、DatabasePath、EnableReset。run.ps1使用b-group/App_Data数据库；直接运行exe时相对路径基于exe目录。模板配置待导出阶段。</w:t>
       </w:r>
     </w:p>
     <w:p>
@@ -3717,7 +3717,7 @@
         <w:rPr>
           <w:b w:val="0"/>
         </w:rPr>
-        <w:t>【已验证】Release构建0警告、0错误；49个自动化用例通过；9项真实HTTP检查含原JSON、重名、修改、删除、负成本及进程重启保留数据。测试结果和详细映射见b-group/docs/MVP1验收记录.md。</w:t>
+        <w:t>【已验证】锁定还原及Release构建0警告、0错误；68个用例通过，含原附件。9项CRUD及8项导入HTTP检查通过，含错误清单和重启。详情见MVP2验收记录。</w:t>
       </w:r>
     </w:p>
     <w:p>
@@ -3734,7 +3734,7 @@
         <w:rPr>
           <w:b w:val="0"/>
         </w:rPr>
-        <w:t>每组先Reset或使用独立测试库。下列01至06已由MVP 1测试和演示覆盖，07至18仍待后续阶段完成。18的完整链路未通过，不等于当前代码不能复现；补充边界的预期依赖本文建议口径。</w:t>
+        <w:t>每组使用独立测试库。01至06已由MVP 1覆盖，07至12已由MVP 2覆盖；13至18留到导出及最终验收。68个自动化用例全部通过，包含原始五列附件；导入真实HTTP演示覆盖同名更新、逐行失败和重启保留。</w:t>
       </w:r>
     </w:p>
     <w:tbl>
@@ -5656,7 +5656,7 @@
         <w:rPr>
           <w:b w:val="0"/>
         </w:rPr>
-        <w:t>基于MVP 1实现表头扫描、两种结构、单元格解析、逐行覆盖和失败报告→完成验收07至12。交付导入接口及报告。你需要能解释哪些行跳过、哪些失败，以及为什么成功2行最终只剩1条。</w:t>
+        <w:t>【已完成】按完整表头兼容五列/十列，十列按安装工程费章节及数字序号识别；NPOI读取单元格，领域校验，逐行覆盖保存并报告失败。验收07至12通过。导入接口、运行脚本及报告均已交付；成功2行最终1条，是同名覆盖的结果。</w:t>
       </w:r>
     </w:p>
     <w:p>
@@ -5696,7 +5696,7 @@
         <w:rPr>
           <w:b w:val="0"/>
         </w:rPr>
-        <w:t>本文件兼有需求规划和阶段状态。MVP 1已完成；后续实现思路说明须随代码更新，说明模型、行识别与容错、表格生成和汇总。答辩要能独立讲清业务与代码，不能仅展示生成结果。</w:t>
+        <w:t>本文件兼有需求规划和阶段状态。MVP 1、2已完成，导出和最终交付待后续阶段。实现思路、README和验收记录随代码同步；答辩要能解释领域规则、行识别与容错、持久化及汇总，不能仅展示结果。</w:t>
       </w:r>
     </w:p>
     <w:p>
@@ -5946,7 +5946,7 @@
         <w:rPr>
           <w:b w:val="0"/>
         </w:rPr>
-        <w:t>当前可运行基线是MVP 1，导入和导出尚未实现。版本历史必须反映实际状态；49个自动化用例及9项HTTP检查只证明本阶段，不作为整个B组已经完成的结论。</w:t>
+        <w:t>当前可运行基线为MVP 2，main保存已验收代码，mvp1、mvp2标签标记阶段版本。导入已完成，导出尚未实现；68个自动化用例及导入HTTP检查只证明当前阶段，不代表整个B组已经完成。</w:t>
       </w:r>
     </w:p>
     <w:sectPr>

</xml_diff>

<commit_message>
feat: export persisted project summaries with verified calculations and layout
</commit_message>
<xml_diff>
--- a/docs/B组需求边界验收标准与MVP实施方案.docx
+++ b/docs/B组需求边界验收标准与MVP实施方案.docx
@@ -15,7 +15,7 @@
         <w:rPr>
           <w:b w:val="0"/>
         </w:rPr>
-        <w:t>其他费用录入 导入 导出  ｜  2026年10月10日  ｜  MVP 2完成更新版</w:t>
+        <w:t>其他费用录入 导入 导出  ｜  2026年10月10日  ｜  MVP 3完成更新版</w:t>
       </w:r>
     </w:p>
     <w:p>
@@ -55,7 +55,7 @@
         <w:rPr>
           <w:b w:val="0"/>
         </w:rPr>
-        <w:t>B组包含新增、查询、修改、删除、导入、导出六个业务接口，另有Reset。技术要求是C#、.NET Framework 4.8、WebAPI、SQLite和NPOI。MVP 1、2已完成：68个自动化用例、9项CRUD与8项导入真实HTTP检查通过。导出和最终交付尚待完成。</w:t>
+        <w:t>B组包含新增、查询、修改、删除、导入、导出六个业务接口，另有Reset。技术要求是C#、.NET Framework 4.8、WebAPI、SQLite和NPOI。MVP 1至3已完成：91个自动化用例、32项真实HTTP检查通过。最终交付及录屏尚待完成。</w:t>
       </w:r>
     </w:p>
     <w:tbl>
@@ -3547,7 +3547,7 @@
         <w:rPr>
           <w:b w:val="0"/>
         </w:rPr>
-        <w:t>WebAPI、OWIN、SQLite和NPOI 2.7.6已按以下版本还原并锁定。MVP 2已接入Excel导入；导出待MVP 3。下列命令展示依赖归属，实际构建使用项目脚本。</w:t>
+        <w:t>WebAPI、OWIN、SQLite和NPOI 2.7.6已还原并锁定，导入及导出均已接入。下列命令展示依赖归属，实际构建使用项目脚本。</w:t>
       </w:r>
     </w:p>
     <w:p>
@@ -3620,7 +3620,7 @@
         <w:rPr>
           <w:b w:val="0"/>
         </w:rPr>
-        <w:t>测试已使用NUnit 3.14.0、适配器4.6.0和Test SDK 17.11.1。SQLite原生文件、schema.sql和种子已复制到输出目录并验证。导出模板将在MVP 3接入。</w:t>
+        <w:t>测试使用NUnit 3.14.0、适配器4.6.0和Test SDK 17.11.1。SQLite原生文件、schema.sql和种子已复制到输出并验证。NPOI按样例版式生成，不依赖原附件模板。</w:t>
       </w:r>
     </w:p>
     <w:p>
@@ -3636,7 +3636,7 @@
         <w:rPr>
           <w:b w:val="0"/>
         </w:rPr>
-        <w:t>App.config定义BaseUrl、DatabasePath、EnableReset。run.ps1使用b-group/App_Data数据库；直接运行exe时相对路径基于exe目录。模板配置待导出阶段。</w:t>
+        <w:t>App.config定义BaseUrl、DatabasePath、EnableReset。run.ps1使用b-group/App_Data数据库；直接运行exe时相对路径基于exe目录。导出版式在生成器中定义。</w:t>
       </w:r>
     </w:p>
     <w:p>
@@ -3717,7 +3717,7 @@
         <w:rPr>
           <w:b w:val="0"/>
         </w:rPr>
-        <w:t>【已验证】锁定还原及Release构建0警告、0错误；68个用例通过，含原附件。9项CRUD及8项导入HTTP检查通过，含错误清单和重启。详情见MVP2验收记录。</w:t>
+        <w:t>【已验证】锁定还原及Release构建0警告、0错误；91个用例通过，含原附件。CRUD、导入、导出HTTP检查共32项通过，含重启和回读。详情见MVP3验收记录。</w:t>
       </w:r>
     </w:p>
     <w:p>
@@ -3734,7 +3734,7 @@
         <w:rPr>
           <w:b w:val="0"/>
         </w:rPr>
-        <w:t>每组使用独立测试库。01至06已由MVP 1覆盖，07至12已由MVP 2覆盖；13至18留到导出及最终验收。68个自动化用例全部通过，包含原始五列附件；导入真实HTTP演示覆盖同名更新、逐行失败和重启保留。</w:t>
+        <w:t>每组使用独立测试库。01至17已由MVP 1至3覆盖，18留到最终验收。91个自动化用例通过，原附件导入后导出、税金及样式、修改删除和重启均已验证；原附件保持不变。</w:t>
       </w:r>
     </w:p>
     <w:tbl>
@@ -5672,7 +5672,7 @@
         <w:rPr>
           <w:b w:val="0"/>
         </w:rPr>
-        <w:t>读取项目和费用→计算汇总及税金→用NPOI按模板生成→完成验收13至17。交付导出接口和可对照Excel。你需要能说明每列数据来自哪里，为什么汇总利润率要重新算，以及模板哪些数值不能照抄。</w:t>
+        <w:t>【已完成】同一数据库事务读取项目和费用，领域计算汇总及税金，NPOI按样例版式生成。验收13至17通过，交付导出接口、可对照Excel及15项HTTP演示；序号从7续排，空收入保留为空。</w:t>
       </w:r>
     </w:p>
     <w:p>
@@ -5696,7 +5696,7 @@
         <w:rPr>
           <w:b w:val="0"/>
         </w:rPr>
-        <w:t>本文件兼有需求规划和阶段状态。MVP 1、2已完成，导出和最终交付待后续阶段。实现思路、README和验收记录随代码同步；答辩要能解释领域规则、行识别与容错、持久化及汇总，不能仅展示结果。</w:t>
+        <w:t>本文件兼有需求规划和阶段状态。MVP 1至3已完成，最终交付待MVP 4。实现思路、README和验收记录随代码同步；答辩要能解释领域规则、行识别与容错、持久化及汇总，不能仅展示结果。</w:t>
       </w:r>
     </w:p>
     <w:p>
@@ -5946,7 +5946,7 @@
         <w:rPr>
           <w:b w:val="0"/>
         </w:rPr>
-        <w:t>当前可运行基线为MVP 2，main保存已验收代码，mvp1、mvp2标签标记阶段版本。导入已完成，导出尚未实现；68个自动化用例及导入HTTP检查只证明当前阶段，不代表整个B组已经完成。</w:t>
+        <w:t>当前可运行基线为MVP 3，main保存已验收代码，mvp1至mvp3标签标记阶段版本。导入、导出已完成；91个自动化用例及32项HTTP检查通过，最终交付及录屏仍待MVP 4。</w:t>
       </w:r>
     </w:p>
     <w:sectPr>

</xml_diff>

<commit_message>
docs: finalize MVP4 implementation notes and screenshot delivery
</commit_message>
<xml_diff>
--- a/docs/B组需求边界验收标准与MVP实施方案.docx
+++ b/docs/B组需求边界验收标准与MVP实施方案.docx
@@ -15,7 +15,7 @@
         <w:rPr>
           <w:b w:val="0"/>
         </w:rPr>
-        <w:t>其他费用录入 导入 导出  ｜  2026年10月10日  ｜  MVP 3完成更新版</w:t>
+        <w:t>其他费用录入 导入 导出  2026年10月10日  最终交付更新版</w:t>
       </w:r>
     </w:p>
     <w:p>
@@ -55,7 +55,7 @@
         <w:rPr>
           <w:b w:val="0"/>
         </w:rPr>
-        <w:t>B组包含新增、查询、修改、删除、导入、导出六个业务接口，另有Reset。技术要求是C#、.NET Framework 4.8、WebAPI、SQLite和NPOI。MVP 1至3已完成：91个自动化用例、32项真实HTTP检查通过。最终交付及录屏尚待完成。</w:t>
+        <w:t>B组包含新增、查询、修改、删除、导入、导出六个业务接口，另有Reset。技术要求为C#、.NET Framework 4.8、WebAPI、SQLite和NPOI。MVP 1至4的程序及材料已整理完成；已有91项自动化测试及32项真实HTTP检查记录。运行演示采用终端截图和Excel对照。</w:t>
       </w:r>
     </w:p>
     <w:tbl>
@@ -525,7 +525,7 @@
                 <w:b w:val="0"/>
                 <w:sz w:val="21"/>
               </w:rPr>
-              <w:t>完整复验 说明文档 录屏</w:t>
+              <w:t>完整复验 实现说明 运行截图</w:t>
             </w:r>
           </w:p>
         </w:tc>
@@ -556,7 +556,7 @@
                 <w:b w:val="0"/>
                 <w:sz w:val="21"/>
               </w:rPr>
-              <w:t>从干净状态复现，交付包可运行，能解释代码</w:t>
+              <w:t>干净源码可复现，交付文件齐全，代码理解按学习进度继续</w:t>
             </w:r>
           </w:p>
         </w:tc>
@@ -3734,7 +3734,7 @@
         <w:rPr>
           <w:b w:val="0"/>
         </w:rPr>
-        <w:t>每组使用独立测试库。01至17已由MVP 1至3覆盖，18留到最终验收。91个自动化用例通过，原附件导入后导出、税金及样式、修改删除和重启均已验证；原附件保持不变。</w:t>
+        <w:t>每组使用独立测试库。验收01至17由MVP 1至3覆盖，18由干净源码验证记录及最终交付材料覆盖。原附件导入后导出、税金及样式、修改删除和重启均已验证，原附件保持不变。验证在当前Windows机器完成并允许复用NuGet缓存，不等同于全新系统验收。</w:t>
       </w:r>
     </w:p>
     <w:tbl>
@@ -5568,15 +5568,8 @@
             </w:tcMar>
           </w:tcPr>
           <w:p>
-            <w:pPr>
-              <w:spacing w:after="0" w:line="259" w:lineRule="auto"/>
-            </w:pPr>
             <w:r>
-              <w:rPr>
-                <w:b w:val="0"/>
-                <w:sz w:val="21"/>
-              </w:rPr>
-              <w:t>从干净环境按README复现</w:t>
+              <w:t>从干净源码目录按README复现</w:t>
             </w:r>
           </w:p>
         </w:tc>
@@ -5599,15 +5592,8 @@
             </w:tcMar>
           </w:tcPr>
           <w:p>
-            <w:pPr>
-              <w:spacing w:after="0" w:line="259" w:lineRule="auto"/>
-            </w:pPr>
             <w:r>
-              <w:rPr>
-                <w:b w:val="0"/>
-                <w:sz w:val="21"/>
-              </w:rPr>
-              <w:t>可还原、编译、启动、Reset及完整演示</w:t>
+              <w:t>已有锁定还原、编译、Reset与完整HTTP记录；最终运行包及说明齐全</w:t>
             </w:r>
           </w:p>
         </w:tc>
@@ -5688,7 +5674,7 @@
         <w:rPr>
           <w:b w:val="0"/>
         </w:rPr>
-        <w:t>完整复验→完成实际实现思路Word和README→录制CRUD、校验失败、导入报告及导出对照→完成验收18。交付完整源码、依赖配置、数据库初始化材料、必要测试和记录、接口集合、实现说明、运行录屏。</w:t>
+        <w:t>【交付完成】保留干净源码验证记录，整理实际实现思路Word、README和提交说明，并提供CRUD、校验失败、导入结果和失败清单的终端截图及打开导出Excel的对照。完整源码、依赖配置、数据库初始化材料、必要测试记录、接口示例和运行包已齐全。原题没有要求视频录制。</w:t>
       </w:r>
     </w:p>
     <w:p>
@@ -5696,7 +5682,7 @@
         <w:rPr>
           <w:b w:val="0"/>
         </w:rPr>
-        <w:t>本文件兼有需求规划和阶段状态。MVP 1至3已完成，最终交付待MVP 4。实现思路、README和验收记录随代码同步；答辩要能解释领域规则、行识别与容错、持久化及汇总，不能仅展示结果。</w:t>
+        <w:t>本文件兼有需求规划和阶段状态。MVP 1至4的程序及材料已完成；实际实现说明和MVP4交付记录说明当前代码及证据。面试前仍需理解领域规则、行识别、事务和汇总计算。用户学习进度单独记录，不以材料交付替代代码理解。</w:t>
       </w:r>
     </w:p>
     <w:p>
@@ -5946,7 +5932,7 @@
         <w:rPr>
           <w:b w:val="0"/>
         </w:rPr>
-        <w:t>当前可运行基线为MVP 3，main保存已验收代码，mvp1至mvp3标签标记阶段版本。导入、导出已完成；91个自动化用例及32项HTTP检查通过，最终交付及录屏仍待MVP 4。</w:t>
+        <w:t>可运行业务基线为已验收的MVP 3提交4d54e7c，最终收尾整理MVP 4材料和复验入口，未修改业务源码。main保存可交付代码，阶段标签用于定位历史。已有91项测试及32项HTTP记录；截图与Excel对照替代原计划中的录屏。</w:t>
       </w:r>
     </w:p>
     <w:sectPr>

</xml_diff>